<commit_message>
Added AI fallback system for all LLM modules
</commit_message>
<xml_diff>
--- a/optimized_resume_1.docx
+++ b/optimized_resume_1.docx
@@ -12,17 +12,7 @@
     </w:p>
     <w:p>
       <w:r>
-        <w:t>Nirjhala Mohapatra</w:t>
-      </w:r>
-    </w:p>
-    <w:p>
-      <w:r>
-        <w:t>+91-8793509128 | mohapatranirjhala@gmail.com</w:t>
-      </w:r>
-    </w:p>
-    <w:p>
-      <w:r>
-        <w:t>LinkedIn: linkedin.com/in/nirjhala-mohapatra | GitHub: github.com/mohapatranirjhala-stack | LeetCode</w:t>
+        <w:t>Nirjhala Mohapatra (cid:131) +91-8793509128 # mohapatranirjhala@gmail.com (cid:239) linkedin.com/in/nirjhala-mohapatra § github.com/mohapatranirjhala-stack — LeetCode</w:t>
       </w:r>
     </w:p>
     <w:p/>
@@ -33,7 +23,7 @@
     </w:p>
     <w:p>
       <w:r>
-        <w:t>Final‑year B.Tech Computer Science Engineering student (2027) with proven experience in full‑stack development, AI/ML, Android, and cloud‑native applications. Expert in building scalable, secure, and responsive solutions using Next.js, Python, Kotlin, Firebase, REST APIs, Retrieval‑Augmented Generation (RAG), and Large Language Models (LLMs). Strong focus on solving real‑world engineering problems through data‑driven design and AI‑powered automation.</w:t>
+        <w:t>Final‑year B.Tech Computer Science Engineering student graduating in 2027 with hands‑on experience in full‑stack development, artificial intelligence, Android, and cloud‑based applications. Skilled in building scalable solutions with Next.js, Python, Kotlin, Firebase, REST APIs, Retrieval‑Augmented Generation (RAG), and large language models (LLMs). Strong focus on solving real‑world engineering problems, a test‑first mindset, and familiarity with AI coding tools such as GitHub Copilot, ChatGPT, and LLMs.</w:t>
       </w:r>
     </w:p>
     <w:p/>
@@ -44,12 +34,80 @@
     </w:p>
     <w:p>
       <w:r>
-        <w:t>VIT Bhopal University – B.Tech Computer Science Engineering (2023–2027)</w:t>
+        <w:t>VIT Bhopal University 2023 – 2027</w:t>
       </w:r>
     </w:p>
     <w:p>
       <w:r>
-        <w:t>CGPA: 8.35/10</w:t>
+        <w:t>Bachelor of Technology in Computer Science Engineering CGPA: 8.35/10</w:t>
+      </w:r>
+    </w:p>
+    <w:p/>
+    <w:p>
+      <w:r>
+        <w:t>Projects</w:t>
+      </w:r>
+    </w:p>
+    <w:p>
+      <w:r>
+        <w:t>AI Career Copilot – AI‑Powered Career Intelligence Platform</w:t>
+      </w:r>
+    </w:p>
+    <w:p>
+      <w:r>
+        <w:t>• Developed a full‑stack AI career platform using Next.js, TypeScript, Firebase, REST APIs, and Groq LLM for resume analysis, ATS scoring, personalized career guidance, and interview preparation.</w:t>
+      </w:r>
+    </w:p>
+    <w:p>
+      <w:r>
+        <w:t>• Implemented AI‑driven resume parsing, skill extraction, job recommendation, and prompt‑engineered LLM workflows to generate personalized career insights.</w:t>
+      </w:r>
+    </w:p>
+    <w:p>
+      <w:r>
+        <w:t>• Integrated Firebase Authentication, Cloud Firestore, and external APIs to build a scalable, secure, and responsive web application with real‑time data handling.</w:t>
+      </w:r>
+    </w:p>
+    <w:p/>
+    <w:p>
+      <w:r>
+        <w:t>AI Document Intelligence – AI‑Powered Document Analysis Platform</w:t>
+      </w:r>
+    </w:p>
+    <w:p>
+      <w:r>
+        <w:t>• Built an AI‑powered document intelligence platform using Python, Streamlit, FAISS, HuggingFace Sentence Transformers, and Groq Llama 3.3 70B.</w:t>
+      </w:r>
+    </w:p>
+    <w:p>
+      <w:r>
+        <w:t>• Implemented Retrieval‑Augmented Generation (RAG), semantic vector search, intelligent document summarization, and context‑aware question answering over PDF, DOCX, and TXT documents.</w:t>
+      </w:r>
+    </w:p>
+    <w:p>
+      <w:r>
+        <w:t>• Designed an end‑to‑end AI pipeline for text extraction, embedding generation, vector indexing, and LLM‑powered conversational document analysis with efficient retrieval.</w:t>
+      </w:r>
+    </w:p>
+    <w:p/>
+    <w:p>
+      <w:r>
+        <w:t>Smart Expense Tracker – Cloud‑Connected Android Financial Management System</w:t>
+      </w:r>
+    </w:p>
+    <w:p>
+      <w:r>
+        <w:t>• Developed a cloud‑connected Android expense management application using Kotlin, Firebase Authentication, Cloud Firestore, and MPAndroidChart.</w:t>
+      </w:r>
+    </w:p>
+    <w:p>
+      <w:r>
+        <w:t>• Implemented secure authentication, real‑time expense synchronization, budget monitoring, category‑wise analytics, interactive dashboards, and PDF report generation.</w:t>
+      </w:r>
+    </w:p>
+    <w:p>
+      <w:r>
+        <w:t>• Designed a scalable Firebase architecture with modular Android components to improve application maintainability, performance, and user experience.</w:t>
       </w:r>
     </w:p>
     <w:p/>
@@ -65,12 +123,12 @@
     </w:p>
     <w:p>
       <w:r>
-        <w:t>Frontend: React.js, Next.js, Streamlit, Tailwind CSS</w:t>
+        <w:t>Front‑End: React.js, Next.js, Streamlit, Tailwind CSS</w:t>
       </w:r>
     </w:p>
     <w:p>
       <w:r>
-        <w:t>Backend: Node.js, Firebase, REST APIs</w:t>
+        <w:t>Back‑End: Node.js, Firebase, REST APIs</w:t>
       </w:r>
     </w:p>
     <w:p>
@@ -80,12 +138,7 @@
     </w:p>
     <w:p>
       <w:r>
-        <w:t>Database: Cloud Firestore (NoSQL), MySQL (SQL)</w:t>
-      </w:r>
-    </w:p>
-    <w:p>
-      <w:r>
-        <w:t>Cloud: Google Cloud Platform (Firebase)</w:t>
+        <w:t>Database: Cloud Firestore (NoSQL), MySQL (SQL), Database Design</w:t>
       </w:r>
     </w:p>
     <w:p>
@@ -96,89 +149,6 @@
     <w:p>
       <w:r>
         <w:t>Core CS: Data Structures &amp; Algorithms, Object‑Oriented Programming, DBMS, Operating Systems, Computer Networks</w:t>
-      </w:r>
-    </w:p>
-    <w:p/>
-    <w:p>
-      <w:r>
-        <w:t>Projects</w:t>
-      </w:r>
-    </w:p>
-    <w:p>
-      <w:r>
-        <w:t>AI Career Copilot – AI‑Powered Career Intelligence Platform</w:t>
-      </w:r>
-    </w:p>
-    <w:p>
-      <w:r>
-        <w:t>GitHub – Live Demo</w:t>
-      </w:r>
-    </w:p>
-    <w:p>
-      <w:r>
-        <w:t>• Designed and deployed a full‑stack platform with Next.js, TypeScript, Firebase, REST APIs, and Groq LLM for resume analysis, ATS scoring, personalized career guidance, and interview preparation.</w:t>
-      </w:r>
-    </w:p>
-    <w:p>
-      <w:r>
-        <w:t>• Implemented AI‑driven resume parsing, skill extraction, job recommendation, and prompt‑engineered LLM workflows to generate actionable career insights.</w:t>
-      </w:r>
-    </w:p>
-    <w:p>
-      <w:r>
-        <w:t>• Integrated Firebase Authentication, Cloud Firestore (NoSQL), and external APIs to build a scalable, secure, and responsive web application with real‑time data handling and asynchronous logic.</w:t>
-      </w:r>
-    </w:p>
-    <w:p/>
-    <w:p>
-      <w:r>
-        <w:t>AI Document Intelligence – AI‑Powered Document Analysis Platform</w:t>
-      </w:r>
-    </w:p>
-    <w:p>
-      <w:r>
-        <w:t>GitHub – Live Demo</w:t>
-      </w:r>
-    </w:p>
-    <w:p>
-      <w:r>
-        <w:t>• Built an AI pipeline using Python, Streamlit, FAISS, HuggingFace Sentence Transformers, and Groq Llama 3.3 70B to perform Retrieval‑Augmented Generation (RAG) and semantic vector search over PDF, DOCX, and TXT documents.</w:t>
-      </w:r>
-    </w:p>
-    <w:p>
-      <w:r>
-        <w:t>• Developed intelligent document summarization, context‑aware question answering, and efficient retrieval mechanisms.</w:t>
-      </w:r>
-    </w:p>
-    <w:p>
-      <w:r>
-        <w:t>• Orchestrated text extraction, embedding generation, vector indexing, and LLM‑powered conversational document analysis on Google Cloud Platform.</w:t>
-      </w:r>
-    </w:p>
-    <w:p/>
-    <w:p>
-      <w:r>
-        <w:t>Smart Expense Tracker – Cloud‑Connected Android Financial Management System</w:t>
-      </w:r>
-    </w:p>
-    <w:p>
-      <w:r>
-        <w:t>GitHub – APK</w:t>
-      </w:r>
-    </w:p>
-    <w:p>
-      <w:r>
-        <w:t>• Developed a Kotlin‑based Android app with Firebase Authentication, Cloud Firestore, and MPAndroidChart for real‑time expense synchronization, budget monitoring, and category‑wise analytics.</w:t>
-      </w:r>
-    </w:p>
-    <w:p>
-      <w:r>
-        <w:t>• Delivered interactive dashboards, PDF report generation, and a modular architecture that enhances maintainability and performance.</w:t>
-      </w:r>
-    </w:p>
-    <w:p>
-      <w:r>
-        <w:t>• Leveraged Firebase’s scalable infrastructure to support secure authentication and real‑time data handling.</w:t>
       </w:r>
     </w:p>
     <w:p/>
@@ -197,7 +167,6 @@
         <w:t>• Applied Machine Learning with Python (Coursera)</w:t>
       </w:r>
     </w:p>
-    <w:p/>
     <w:sectPr>
       <w:pgSz w:w="12240" w:h="15840"/>
       <w:pgMar w:top="1440" w:right="1800" w:bottom="1440" w:left="1800" w:header="720" w:footer="720" w:gutter="0"/>

</xml_diff>